<commit_message>
refactor(catalog.album): implement delete refactor(catalog.album.update): fix swapping main and feat artist
</commit_message>
<xml_diff>
--- a/docs/deletion-strategy.docx
+++ b/docs/deletion-strategy.docx
@@ -18,7 +18,7 @@
       </w:r>
       <w:r>
         <w:rPr>
-          <w:rStyle w:val="Tekstrdowy"/>
+          <w:rStyle w:val="Tekstrdowyuser"/>
           <w:b/>
         </w:rPr>
         <w:t>song_artist</w:t>
@@ -31,7 +31,7 @@
       </w:r>
       <w:r>
         <w:rPr>
-          <w:rStyle w:val="Tekstrdowy"/>
+          <w:rStyle w:val="Tekstrdowyuser"/>
           <w:b/>
         </w:rPr>
         <w:t>album_artist</w:t>
@@ -44,7 +44,7 @@
       </w:r>
       <w:r>
         <w:rPr>
-          <w:rStyle w:val="Tekstrdowy"/>
+          <w:rStyle w:val="Tekstrdowyuser"/>
           <w:b/>
         </w:rPr>
         <w:t>NULL</w:t>
@@ -57,7 +57,7 @@
       </w:r>
       <w:r>
         <w:rPr>
-          <w:rStyle w:val="Tekstrdowy"/>
+          <w:rStyle w:val="Tekstrdowyuser"/>
           <w:b/>
         </w:rPr>
         <w:t>genre_id</w:t>
@@ -70,7 +70,7 @@
       </w:r>
       <w:r>
         <w:rPr>
-          <w:rStyle w:val="Tekstrdowy"/>
+          <w:rStyle w:val="Tekstrdowyuser"/>
           <w:b/>
         </w:rPr>
         <w:t>album_id</w:t>
@@ -118,172 +118,6 @@
           <w:i/>
         </w:rPr>
         <w:t>Architecture: Hard Block (Restrict).</w:t>
-      </w:r>
-    </w:p>
-    <w:p>
-      <w:pPr>
-        <w:pStyle w:val="BodyText"/>
-        <w:numPr>
-          <w:ilvl w:val="0"/>
-          <w:numId w:val="1"/>
-        </w:numPr>
-        <w:tabs>
-          <w:tab w:val="left" w:pos="709" w:leader="none"/>
-        </w:tabs>
-        <w:bidi w:val="0"/>
-        <w:ind w:hanging="283" w:start="709"/>
-        <w:jc w:val="start"/>
-        <w:rPr/>
-      </w:pPr>
-      <w:r>
-        <w:rPr>
-          <w:b/>
-        </w:rPr>
-        <w:t>Deletion Action:</w:t>
-      </w:r>
-      <w:r>
-        <w:rPr/>
-        <w:t xml:space="preserve"> Before executing the </w:t>
-      </w:r>
-      <w:r>
-        <w:rPr>
-          <w:rStyle w:val="Tekstrdowy"/>
-        </w:rPr>
-        <w:t>genre.deactivate()</w:t>
-      </w:r>
-      <w:r>
-        <w:rPr/>
-        <w:t xml:space="preserve"> method, the service runs a query: </w:t>
-      </w:r>
-      <w:r>
-        <w:rPr>
-          <w:rStyle w:val="Tekstrdowy"/>
-        </w:rPr>
-        <w:t>songRepository.existsByGenreId(id)</w:t>
-      </w:r>
-      <w:r>
-        <w:rPr/>
-        <w:t>.</w:t>
-      </w:r>
-    </w:p>
-    <w:p>
-      <w:pPr>
-        <w:pStyle w:val="BodyText"/>
-        <w:numPr>
-          <w:ilvl w:val="0"/>
-          <w:numId w:val="1"/>
-        </w:numPr>
-        <w:tabs>
-          <w:tab w:val="left" w:pos="709" w:leader="none"/>
-        </w:tabs>
-        <w:bidi w:val="0"/>
-        <w:ind w:hanging="283" w:start="709"/>
-        <w:jc w:val="start"/>
-        <w:rPr/>
-      </w:pPr>
-      <w:r>
-        <w:rPr>
-          <w:b/>
-        </w:rPr>
-        <w:t>Effect (if songs exist):</w:t>
-      </w:r>
-      <w:r>
-        <w:rPr/>
-        <w:t xml:space="preserve"> Throws a custom </w:t>
-      </w:r>
-      <w:r>
-        <w:rPr>
-          <w:rStyle w:val="Tekstrdowy"/>
-        </w:rPr>
-        <w:t>DataConflictException</w:t>
-      </w:r>
-      <w:r>
-        <w:rPr/>
-        <w:t xml:space="preserve"> (HTTP 409 Conflict).</w:t>
-      </w:r>
-    </w:p>
-    <w:p>
-      <w:pPr>
-        <w:pStyle w:val="BodyText"/>
-        <w:numPr>
-          <w:ilvl w:val="0"/>
-          <w:numId w:val="1"/>
-        </w:numPr>
-        <w:tabs>
-          <w:tab w:val="left" w:pos="709" w:leader="none"/>
-        </w:tabs>
-        <w:bidi w:val="0"/>
-        <w:ind w:hanging="283" w:start="709"/>
-        <w:jc w:val="start"/>
-        <w:rPr/>
-      </w:pPr>
-      <w:r>
-        <w:rPr>
-          <w:b/>
-        </w:rPr>
-        <w:t>Business Process:</w:t>
-      </w:r>
-      <w:r>
-        <w:rPr/>
-        <w:t xml:space="preserve"> The administrator receives the error in the panel and must use a dedicated operational endpoint: </w:t>
-      </w:r>
-      <w:r>
-        <w:rPr>
-          <w:rStyle w:val="Tekstrdowy"/>
-        </w:rPr>
-        <w:t>PATCH /api/admin/genres/{oldId}/transfer-to/{newId}</w:t>
-      </w:r>
-      <w:r>
-        <w:rPr/>
-        <w:t xml:space="preserve">. The service bulk-updates the </w:t>
-      </w:r>
-      <w:r>
-        <w:rPr>
-          <w:rStyle w:val="Tekstrdowy"/>
-        </w:rPr>
-        <w:t>genre_id</w:t>
-      </w:r>
-      <w:r>
-        <w:rPr/>
-        <w:t xml:space="preserve"> field in the associated songs to the new ID, and only then calls </w:t>
-      </w:r>
-      <w:r>
-        <w:rPr>
-          <w:rStyle w:val="Tekstrdowy"/>
-        </w:rPr>
-        <w:t>genre.deactivate()</w:t>
-      </w:r>
-      <w:r>
-        <w:rPr/>
-        <w:t xml:space="preserve"> on the old genre.</w:t>
-      </w:r>
-    </w:p>
-    <w:p>
-      <w:pPr>
-        <w:pStyle w:val="Heading3"/>
-        <w:bidi w:val="0"/>
-        <w:jc w:val="start"/>
-        <w:rPr/>
-      </w:pPr>
-      <w:r>
-        <w:rPr/>
-        <w:t>2. Strategy for: Album</w:t>
-      </w:r>
-    </w:p>
-    <w:p>
-      <w:pPr>
-        <w:pStyle w:val="BodyText"/>
-        <w:bidi w:val="0"/>
-        <w:jc w:val="start"/>
-        <w:rPr>
-          <w:i/>
-        </w:rPr>
-      </w:pPr>
-      <w:r>
-        <w:rPr>
-          <w:i/>
-        </w:rPr>
-        <w:t>Architecture: Soft Separation (Logical Singles).</w:t>
       </w:r>
     </w:p>
     <w:p>
@@ -309,17 +143,27 @@
       </w:r>
       <w:r>
         <w:rPr/>
-        <w:t xml:space="preserve"> The service exclusively calls </w:t>
-      </w:r>
-      <w:r>
-        <w:rPr>
-          <w:rStyle w:val="Tekstrdowy"/>
-        </w:rPr>
-        <w:t>album.deactivate()</w:t>
-      </w:r>
-      <w:r>
-        <w:rPr/>
-        <w:t>. It does not touch the song entities or foreign keys.</w:t>
+        <w:t xml:space="preserve"> Before executing the </w:t>
+      </w:r>
+      <w:r>
+        <w:rPr>
+          <w:rStyle w:val="Tekstrdowyuser"/>
+        </w:rPr>
+        <w:t>genre.deactivate()</w:t>
+      </w:r>
+      <w:r>
+        <w:rPr/>
+        <w:t xml:space="preserve"> method, the service runs a query: </w:t>
+      </w:r>
+      <w:r>
+        <w:rPr>
+          <w:rStyle w:val="Tekstrdowyuser"/>
+        </w:rPr>
+        <w:t>songRepository.existsByGenreId(id)</w:t>
+      </w:r>
+      <w:r>
+        <w:rPr/>
+        <w:t>.</w:t>
       </w:r>
     </w:p>
     <w:p>
@@ -341,21 +185,21 @@
         <w:rPr>
           <w:b/>
         </w:rPr>
-        <w:t>What happens to the songs?</w:t>
-      </w:r>
-      <w:r>
-        <w:rPr/>
-        <w:t xml:space="preserve"> The songs physically still point to this album (the </w:t>
-      </w:r>
-      <w:r>
-        <w:rPr>
-          <w:rStyle w:val="Tekstrdowy"/>
-        </w:rPr>
-        <w:t>album_id</w:t>
-      </w:r>
-      <w:r>
-        <w:rPr/>
-        <w:t xml:space="preserve"> remains intact).</w:t>
+        <w:t>Effect (if songs exist):</w:t>
+      </w:r>
+      <w:r>
+        <w:rPr/>
+        <w:t xml:space="preserve"> Throws a custom </w:t>
+      </w:r>
+      <w:r>
+        <w:rPr>
+          <w:rStyle w:val="Tekstrdowyuser"/>
+        </w:rPr>
+        <w:t>DataConflictException</w:t>
+      </w:r>
+      <w:r>
+        <w:rPr/>
+        <w:t xml:space="preserve"> (HTTP 409 Conflict).</w:t>
       </w:r>
     </w:p>
     <w:p>
@@ -377,107 +221,41 @@
         <w:rPr>
           <w:b/>
         </w:rPr>
-        <w:t>Intent Mapping (Singles):</w:t>
-      </w:r>
-      <w:r>
-        <w:rPr/>
-        <w:t xml:space="preserve"> In the </w:t>
-      </w:r>
-      <w:r>
-        <w:rPr>
-          <w:rStyle w:val="Tekstrdowy"/>
-        </w:rPr>
-        <w:t>SongMapper</w:t>
-      </w:r>
-      <w:r>
-        <w:rPr/>
-        <w:t xml:space="preserve"> (MapStruct), you implement a method using the </w:t>
-      </w:r>
-      <w:r>
-        <w:rPr>
-          <w:rStyle w:val="Tekstrdowy"/>
-        </w:rPr>
-        <w:t>@AfterMapping</w:t>
-      </w:r>
-      <w:r>
-        <w:rPr/>
-        <w:t xml:space="preserve"> annotation. It checks if the associated </w:t>
-      </w:r>
-      <w:r>
-        <w:rPr>
-          <w:rStyle w:val="Tekstrdowy"/>
-        </w:rPr>
-        <w:t>Album</w:t>
-      </w:r>
-      <w:r>
-        <w:rPr/>
-        <w:t xml:space="preserve"> object has the </w:t>
-      </w:r>
-      <w:r>
-        <w:rPr>
-          <w:rStyle w:val="Tekstrdowy"/>
-        </w:rPr>
-        <w:t>active == false</w:t>
-      </w:r>
-      <w:r>
-        <w:rPr/>
-        <w:t xml:space="preserve"> flag. If it does, the mapper sets the </w:t>
-      </w:r>
-      <w:r>
-        <w:rPr>
-          <w:rStyle w:val="Tekstrdowy"/>
-        </w:rPr>
-        <w:t>album</w:t>
-      </w:r>
-      <w:r>
-        <w:rPr/>
-        <w:t xml:space="preserve"> field in the DTO to </w:t>
-      </w:r>
-      <w:r>
-        <w:rPr>
-          <w:rStyle w:val="Tekstrdowy"/>
-        </w:rPr>
-        <w:t>null</w:t>
-      </w:r>
-      <w:r>
-        <w:rPr/>
-        <w:t>.</w:t>
-      </w:r>
-    </w:p>
-    <w:p>
-      <w:pPr>
-        <w:pStyle w:val="BodyText"/>
-        <w:numPr>
-          <w:ilvl w:val="0"/>
-          <w:numId w:val="2"/>
-        </w:numPr>
-        <w:tabs>
-          <w:tab w:val="left" w:pos="709" w:leader="none"/>
-        </w:tabs>
-        <w:bidi w:val="0"/>
-        <w:ind w:hanging="283" w:start="709"/>
-        <w:jc w:val="start"/>
-        <w:rPr/>
-      </w:pPr>
-      <w:r>
-        <w:rPr>
-          <w:b/>
-        </w:rPr>
-        <w:t>Effect:</w:t>
-      </w:r>
-      <w:r>
-        <w:rPr/>
-        <w:t xml:space="preserve"> The end-client sees the song as a standalone single. The database retains 100% of the history and the ability to fully, losslessly restore the album via a </w:t>
-      </w:r>
-      <w:r>
-        <w:rPr>
-          <w:rStyle w:val="Tekstrdowy"/>
-        </w:rPr>
-        <w:t>restore()</w:t>
-      </w:r>
-      <w:r>
-        <w:rPr/>
-        <w:t xml:space="preserve"> method.</w:t>
+        <w:t>Business Process:</w:t>
+      </w:r>
+      <w:r>
+        <w:rPr/>
+        <w:t xml:space="preserve"> The administrator receives the error in the panel and must use a dedicated operational endpoint: </w:t>
+      </w:r>
+      <w:r>
+        <w:rPr>
+          <w:rStyle w:val="Tekstrdowyuser"/>
+        </w:rPr>
+        <w:t>PATCH /api/admin/genres/{oldId}/transfer-to/{newId}</w:t>
+      </w:r>
+      <w:r>
+        <w:rPr/>
+        <w:t xml:space="preserve">. The service bulk-updates the </w:t>
+      </w:r>
+      <w:r>
+        <w:rPr>
+          <w:rStyle w:val="Tekstrdowyuser"/>
+        </w:rPr>
+        <w:t>genre_id</w:t>
+      </w:r>
+      <w:r>
+        <w:rPr/>
+        <w:t xml:space="preserve"> field in the associated songs to the new ID, and only then calls </w:t>
+      </w:r>
+      <w:r>
+        <w:rPr>
+          <w:rStyle w:val="Tekstrdowyuser"/>
+        </w:rPr>
+        <w:t>genre.deactivate()</w:t>
+      </w:r>
+      <w:r>
+        <w:rPr/>
+        <w:t xml:space="preserve"> on the old genre.</w:t>
       </w:r>
     </w:p>
     <w:p>
@@ -489,13 +267,13 @@
       </w:pPr>
       <w:r>
         <w:rPr/>
-        <w:t xml:space="preserve">3. </w:t>
-      </w:r>
-      <w:r>
-        <w:rPr>
-          <w:color w:val="81D41A"/>
-        </w:rPr>
-        <w:t>Strategy for: Song</w:t>
+        <w:t xml:space="preserve">2. </w:t>
+      </w:r>
+      <w:r>
+        <w:rPr>
+          <w:color w:val="00A933"/>
+        </w:rPr>
+        <w:t>Strategy for: Album</w:t>
       </w:r>
     </w:p>
     <w:p>
@@ -511,7 +289,7 @@
         <w:rPr>
           <w:i/>
         </w:rPr>
-        <w:t>Architecture: Cascade to Child Resources (Catalog Leaf).</w:t>
+        <w:t>Architecture: Soft Separation (Logical Singles).</w:t>
       </w:r>
     </w:p>
     <w:p>
@@ -537,17 +315,17 @@
       </w:r>
       <w:r>
         <w:rPr/>
-        <w:t xml:space="preserve"> The service calls </w:t>
-      </w:r>
-      <w:r>
-        <w:rPr>
-          <w:rStyle w:val="Tekstrdowy"/>
-        </w:rPr>
-        <w:t>song.deactivate()</w:t>
-      </w:r>
-      <w:r>
-        <w:rPr/>
-        <w:t>.</w:t>
+        <w:t xml:space="preserve"> The service exclusively calls </w:t>
+      </w:r>
+      <w:r>
+        <w:rPr>
+          <w:rStyle w:val="Tekstrdowyuser"/>
+        </w:rPr>
+        <w:t>album.deactivate()</w:t>
+      </w:r>
+      <w:r>
+        <w:rPr/>
+        <w:t>. It does not touch the song entities or foreign keys.</w:t>
       </w:r>
     </w:p>
     <w:p>
@@ -569,34 +347,21 @@
         <w:rPr>
           <w:b/>
         </w:rPr>
-        <w:t>Price Management (</w:t>
-      </w:r>
-      <w:r>
-        <w:rPr>
-          <w:rStyle w:val="Tekstrdowy"/>
-          <w:b/>
-        </w:rPr>
-        <w:t>song_price</w:t>
-      </w:r>
-      <w:r>
-        <w:rPr>
-          <w:b/>
-        </w:rPr>
-        <w:t>):</w:t>
-      </w:r>
-      <w:r>
-        <w:rPr/>
-        <w:t xml:space="preserve"> The service iterates through the assigned price tiers and calls </w:t>
-      </w:r>
-      <w:r>
-        <w:rPr>
-          <w:rStyle w:val="Tekstrdowy"/>
-        </w:rPr>
-        <w:t>songPrice.deactivate()</w:t>
-      </w:r>
-      <w:r>
-        <w:rPr/>
-        <w:t xml:space="preserve"> on them. This prevents "orphaned" price lists from appearing in queries.</w:t>
+        <w:t>What happens to the songs?</w:t>
+      </w:r>
+      <w:r>
+        <w:rPr/>
+        <w:t xml:space="preserve"> The songs physically still point to this album (the </w:t>
+      </w:r>
+      <w:r>
+        <w:rPr>
+          <w:rStyle w:val="Tekstrdowyuser"/>
+        </w:rPr>
+        <w:t>album_id</w:t>
+      </w:r>
+      <w:r>
+        <w:rPr/>
+        <w:t xml:space="preserve"> remains intact).</w:t>
       </w:r>
     </w:p>
     <w:p>
@@ -618,21 +383,71 @@
         <w:rPr>
           <w:b/>
         </w:rPr>
-        <w:t>Payment Module:</w:t>
-      </w:r>
-      <w:r>
-        <w:rPr/>
-        <w:t xml:space="preserve"> The endpoint creating the Stripe session must first validate whether the provided song ID has the </w:t>
-      </w:r>
-      <w:r>
-        <w:rPr>
-          <w:rStyle w:val="Tekstrdowy"/>
-        </w:rPr>
-        <w:t>active == true</w:t>
-      </w:r>
-      <w:r>
-        <w:rPr/>
-        <w:t xml:space="preserve"> flag. Deactivated tracks are immediately blocked from purchase.</w:t>
+        <w:t>Intent Mapping (Singles):</w:t>
+      </w:r>
+      <w:r>
+        <w:rPr/>
+        <w:t xml:space="preserve"> In the </w:t>
+      </w:r>
+      <w:r>
+        <w:rPr>
+          <w:rStyle w:val="Tekstrdowyuser"/>
+        </w:rPr>
+        <w:t>SongMapper</w:t>
+      </w:r>
+      <w:r>
+        <w:rPr/>
+        <w:t xml:space="preserve"> (MapStruct), you implement a method using the </w:t>
+      </w:r>
+      <w:r>
+        <w:rPr>
+          <w:rStyle w:val="Tekstrdowyuser"/>
+        </w:rPr>
+        <w:t>@AfterMapping</w:t>
+      </w:r>
+      <w:r>
+        <w:rPr/>
+        <w:t xml:space="preserve"> annotation. It checks if the associated </w:t>
+      </w:r>
+      <w:r>
+        <w:rPr>
+          <w:rStyle w:val="Tekstrdowyuser"/>
+        </w:rPr>
+        <w:t>Album</w:t>
+      </w:r>
+      <w:r>
+        <w:rPr/>
+        <w:t xml:space="preserve"> object has the </w:t>
+      </w:r>
+      <w:r>
+        <w:rPr>
+          <w:rStyle w:val="Tekstrdowyuser"/>
+        </w:rPr>
+        <w:t>active == false</w:t>
+      </w:r>
+      <w:r>
+        <w:rPr/>
+        <w:t xml:space="preserve"> flag. If it does, the mapper sets the </w:t>
+      </w:r>
+      <w:r>
+        <w:rPr>
+          <w:rStyle w:val="Tekstrdowyuser"/>
+        </w:rPr>
+        <w:t>album</w:t>
+      </w:r>
+      <w:r>
+        <w:rPr/>
+        <w:t xml:space="preserve"> field in the DTO to </w:t>
+      </w:r>
+      <w:r>
+        <w:rPr>
+          <w:rStyle w:val="Tekstrdowyuser"/>
+        </w:rPr>
+        <w:t>null</w:t>
+      </w:r>
+      <w:r>
+        <w:rPr/>
+        <w:t>.</w:t>
       </w:r>
     </w:p>
     <w:p>
@@ -654,21 +469,21 @@
         <w:rPr>
           <w:b/>
         </w:rPr>
-        <w:t>Licensing Module:</w:t>
-      </w:r>
-      <w:r>
-        <w:rPr/>
-        <w:t xml:space="preserve"> Because the track was soft-deleted, previously generated license certificates can still fetch the song title and metadata via a table </w:t>
-      </w:r>
-      <w:r>
-        <w:rPr>
-          <w:rStyle w:val="Tekstrdowy"/>
-        </w:rPr>
-        <w:t>JOIN</w:t>
-      </w:r>
-      <w:r>
-        <w:rPr/>
-        <w:t xml:space="preserve"> to populate the customer's account history view.</w:t>
+        <w:t>Effect:</w:t>
+      </w:r>
+      <w:r>
+        <w:rPr/>
+        <w:t xml:space="preserve"> The end-client sees the song as a standalone single. The database retains 100% of the history and the ability to fully, losslessly restore the album via a </w:t>
+      </w:r>
+      <w:r>
+        <w:rPr>
+          <w:rStyle w:val="Tekstrdowyuser"/>
+        </w:rPr>
+        <w:t>restore()</w:t>
+      </w:r>
+      <w:r>
+        <w:rPr/>
+        <w:t xml:space="preserve"> method.</w:t>
       </w:r>
     </w:p>
     <w:p>
@@ -680,40 +495,29 @@
       </w:pPr>
       <w:r>
         <w:rPr/>
-        <w:t xml:space="preserve">4. </w:t>
-      </w:r>
-      <w:r>
-        <w:rPr>
-          <w:color w:val="00A933"/>
-        </w:rPr>
-        <w:t>Strategy for: Artist</w:t>
-      </w:r>
-    </w:p>
-    <w:p>
-      <w:pPr>
-        <w:pStyle w:val="BodyText"/>
-        <w:bidi w:val="0"/>
-        <w:jc w:val="start"/>
-        <w:rPr/>
-      </w:pPr>
-      <w:r>
+        <w:t xml:space="preserve">3. </w:t>
+      </w:r>
+      <w:r>
+        <w:rPr>
+          <w:color w:val="81D41A"/>
+        </w:rPr>
+        <w:t>Strategy for: Song</w:t>
+      </w:r>
+    </w:p>
+    <w:p>
+      <w:pPr>
+        <w:pStyle w:val="BodyText"/>
+        <w:bidi w:val="0"/>
+        <w:jc w:val="start"/>
         <w:rPr>
           <w:i/>
         </w:rPr>
-        <w:t xml:space="preserve">Architecture: Hierarchical Branched Deactivation (Based on </w:t>
-      </w:r>
-      <w:r>
-        <w:rPr>
-          <w:rStyle w:val="Tekstrdowy"/>
+      </w:pPr>
+      <w:r>
+        <w:rPr>
           <w:i/>
         </w:rPr>
-        <w:t>artist_order</w:t>
-      </w:r>
-      <w:r>
-        <w:rPr>
-          <w:i/>
-        </w:rPr>
-        <w:t>).</w:t>
+        <w:t>Architecture: Cascade to Child Resources (Catalog Leaf).</w:t>
       </w:r>
     </w:p>
     <w:p>
@@ -739,13 +543,13 @@
       </w:r>
       <w:r>
         <w:rPr/>
-        <w:t xml:space="preserve"> The service loads the artist's relations and calls </w:t>
-      </w:r>
-      <w:r>
-        <w:rPr>
-          <w:rStyle w:val="Tekstrdowy"/>
-        </w:rPr>
-        <w:t>artist.deactivate()</w:t>
+        <w:t xml:space="preserve"> The service calls </w:t>
+      </w:r>
+      <w:r>
+        <w:rPr>
+          <w:rStyle w:val="Tekstrdowyuser"/>
+        </w:rPr>
+        <w:t>song.deactivate()</w:t>
       </w:r>
       <w:r>
         <w:rPr/>
@@ -771,92 +575,34 @@
         <w:rPr>
           <w:b/>
         </w:rPr>
-        <w:t>Cascade Logic (</w:t>
-      </w:r>
-      <w:r>
-        <w:rPr>
-          <w:rStyle w:val="Tekstrdowy"/>
-          <w:b/>
-        </w:rPr>
-        <w:t>Order == 0</w:t>
-      </w:r>
-      <w:r>
-        <w:rPr>
-          <w:b/>
-        </w:rPr>
-        <w:t xml:space="preserve"> - Primary Creator):</w:t>
-      </w:r>
-    </w:p>
-    <w:p>
-      <w:pPr>
-        <w:pStyle w:val="BodyText"/>
-        <w:numPr>
-          <w:ilvl w:val="1"/>
-          <w:numId w:val="4"/>
-        </w:numPr>
-        <w:tabs>
-          <w:tab w:val="clear" w:pos="709"/>
-          <w:tab w:val="left" w:pos="1418" w:leader="none"/>
-        </w:tabs>
-        <w:bidi w:val="0"/>
-        <w:ind w:hanging="283" w:start="1418"/>
-        <w:jc w:val="start"/>
-        <w:rPr/>
-      </w:pPr>
-      <w:r>
-        <w:rPr/>
-        <w:t xml:space="preserve">Find all songs where this artist has </w:t>
-      </w:r>
-      <w:r>
-        <w:rPr>
-          <w:rStyle w:val="Tekstrdowy"/>
-        </w:rPr>
-        <w:t>artist_order == 0</w:t>
-      </w:r>
-      <w:r>
-        <w:rPr/>
-        <w:t xml:space="preserve">. Call </w:t>
-      </w:r>
-      <w:r>
-        <w:rPr>
-          <w:rStyle w:val="Tekstrdowy"/>
-        </w:rPr>
-        <w:t>song.deactivate()</w:t>
-      </w:r>
-      <w:r>
-        <w:rPr/>
-        <w:t xml:space="preserve"> on each of them. (This will also trigger the cascade to Prices, as described in point 3).</w:t>
-      </w:r>
-    </w:p>
-    <w:p>
-      <w:pPr>
-        <w:pStyle w:val="BodyText"/>
-        <w:numPr>
-          <w:ilvl w:val="1"/>
-          <w:numId w:val="4"/>
-        </w:numPr>
-        <w:tabs>
-          <w:tab w:val="clear" w:pos="709"/>
-          <w:tab w:val="left" w:pos="1418" w:leader="none"/>
-        </w:tabs>
-        <w:bidi w:val="0"/>
-        <w:ind w:hanging="283" w:start="1418"/>
-        <w:jc w:val="start"/>
-        <w:rPr/>
-      </w:pPr>
-      <w:r>
-        <w:rPr/>
-        <w:t xml:space="preserve">Find solo albums (where they are the only creator at position 0) and call </w:t>
-      </w:r>
-      <w:r>
-        <w:rPr>
-          <w:rStyle w:val="Tekstrdowy"/>
-        </w:rPr>
-        <w:t>album.deactivate()</w:t>
-      </w:r>
-      <w:r>
-        <w:rPr/>
-        <w:t xml:space="preserve"> on them.</w:t>
+        <w:t>Price Management (</w:t>
+      </w:r>
+      <w:r>
+        <w:rPr>
+          <w:rStyle w:val="Tekstrdowyuser"/>
+          <w:b/>
+        </w:rPr>
+        <w:t>song_price</w:t>
+      </w:r>
+      <w:r>
+        <w:rPr>
+          <w:b/>
+        </w:rPr>
+        <w:t>):</w:t>
+      </w:r>
+      <w:r>
+        <w:rPr/>
+        <w:t xml:space="preserve"> The service iterates through the assigned price tiers and calls </w:t>
+      </w:r>
+      <w:r>
+        <w:rPr>
+          <w:rStyle w:val="Tekstrdowyuser"/>
+        </w:rPr>
+        <w:t>songPrice.deactivate()</w:t>
+      </w:r>
+      <w:r>
+        <w:rPr/>
+        <w:t xml:space="preserve"> on them. This prevents "orphaned" price lists from appearing in queries.</w:t>
       </w:r>
     </w:p>
     <w:p>
@@ -878,51 +624,21 @@
         <w:rPr>
           <w:b/>
         </w:rPr>
-        <w:t>Passive Logic (</w:t>
-      </w:r>
-      <w:r>
-        <w:rPr>
-          <w:rStyle w:val="Tekstrdowy"/>
-          <w:b/>
-        </w:rPr>
-        <w:t>Order &gt; 0</w:t>
-      </w:r>
-      <w:r>
-        <w:rPr>
-          <w:b/>
-        </w:rPr>
-        <w:t xml:space="preserve"> - Guest/Featured):</w:t>
-      </w:r>
-    </w:p>
-    <w:p>
-      <w:pPr>
-        <w:pStyle w:val="BodyText"/>
-        <w:numPr>
-          <w:ilvl w:val="1"/>
-          <w:numId w:val="4"/>
-        </w:numPr>
-        <w:tabs>
-          <w:tab w:val="clear" w:pos="709"/>
-          <w:tab w:val="left" w:pos="1418" w:leader="none"/>
-        </w:tabs>
-        <w:bidi w:val="0"/>
-        <w:ind w:hanging="283" w:start="1418"/>
-        <w:jc w:val="start"/>
-        <w:rPr/>
-      </w:pPr>
-      <w:r>
-        <w:rPr/>
-        <w:t>If the artist appears exclusively in secondary positions, you do not damage other creators' resources. The primary artist's song remains active (</w:t>
-      </w:r>
-      <w:r>
-        <w:rPr>
-          <w:rStyle w:val="Tekstrdowy"/>
-        </w:rPr>
-        <w:t>active = true</w:t>
-      </w:r>
-      <w:r>
-        <w:rPr/>
-        <w:t>).</w:t>
+        <w:t>Payment Module:</w:t>
+      </w:r>
+      <w:r>
+        <w:rPr/>
+        <w:t xml:space="preserve"> The endpoint creating the Stripe session must first validate whether the provided song ID has the </w:t>
+      </w:r>
+      <w:r>
+        <w:rPr>
+          <w:rStyle w:val="Tekstrdowyuser"/>
+        </w:rPr>
+        <w:t>active == true</w:t>
+      </w:r>
+      <w:r>
+        <w:rPr/>
+        <w:t xml:space="preserve"> flag. Deactivated tracks are immediately blocked from purchase.</w:t>
       </w:r>
     </w:p>
     <w:p>
@@ -944,6 +660,296 @@
         <w:rPr>
           <w:b/>
         </w:rPr>
+        <w:t>Licensing Module:</w:t>
+      </w:r>
+      <w:r>
+        <w:rPr/>
+        <w:t xml:space="preserve"> Because the track was soft-deleted, previously generated license certificates can still fetch the song title and metadata via a table </w:t>
+      </w:r>
+      <w:r>
+        <w:rPr>
+          <w:rStyle w:val="Tekstrdowyuser"/>
+        </w:rPr>
+        <w:t>JOIN</w:t>
+      </w:r>
+      <w:r>
+        <w:rPr/>
+        <w:t xml:space="preserve"> to populate the customer's account history view.</w:t>
+      </w:r>
+    </w:p>
+    <w:p>
+      <w:pPr>
+        <w:pStyle w:val="Heading3"/>
+        <w:bidi w:val="0"/>
+        <w:jc w:val="start"/>
+        <w:rPr/>
+      </w:pPr>
+      <w:r>
+        <w:rPr/>
+        <w:t xml:space="preserve">4. </w:t>
+      </w:r>
+      <w:r>
+        <w:rPr>
+          <w:color w:val="00A933"/>
+        </w:rPr>
+        <w:t>Strategy for: Artist</w:t>
+      </w:r>
+    </w:p>
+    <w:p>
+      <w:pPr>
+        <w:pStyle w:val="BodyText"/>
+        <w:bidi w:val="0"/>
+        <w:jc w:val="start"/>
+        <w:rPr/>
+      </w:pPr>
+      <w:r>
+        <w:rPr>
+          <w:i/>
+        </w:rPr>
+        <w:t xml:space="preserve">Architecture: Hierarchical Branched Deactivation (Based on </w:t>
+      </w:r>
+      <w:r>
+        <w:rPr>
+          <w:rStyle w:val="Tekstrdowyuser"/>
+          <w:i/>
+        </w:rPr>
+        <w:t>artist_order</w:t>
+      </w:r>
+      <w:r>
+        <w:rPr>
+          <w:i/>
+        </w:rPr>
+        <w:t>).</w:t>
+      </w:r>
+    </w:p>
+    <w:p>
+      <w:pPr>
+        <w:pStyle w:val="BodyText"/>
+        <w:numPr>
+          <w:ilvl w:val="0"/>
+          <w:numId w:val="5"/>
+        </w:numPr>
+        <w:tabs>
+          <w:tab w:val="left" w:pos="709" w:leader="none"/>
+        </w:tabs>
+        <w:bidi w:val="0"/>
+        <w:ind w:hanging="283" w:start="709"/>
+        <w:jc w:val="start"/>
+        <w:rPr/>
+      </w:pPr>
+      <w:r>
+        <w:rPr>
+          <w:b/>
+        </w:rPr>
+        <w:t>Deletion Action:</w:t>
+      </w:r>
+      <w:r>
+        <w:rPr/>
+        <w:t xml:space="preserve"> The service loads the artist's relations and calls </w:t>
+      </w:r>
+      <w:r>
+        <w:rPr>
+          <w:rStyle w:val="Tekstrdowyuser"/>
+        </w:rPr>
+        <w:t>artist.deactivate()</w:t>
+      </w:r>
+      <w:r>
+        <w:rPr/>
+        <w:t>.</w:t>
+      </w:r>
+    </w:p>
+    <w:p>
+      <w:pPr>
+        <w:pStyle w:val="BodyText"/>
+        <w:numPr>
+          <w:ilvl w:val="0"/>
+          <w:numId w:val="5"/>
+        </w:numPr>
+        <w:tabs>
+          <w:tab w:val="left" w:pos="709" w:leader="none"/>
+        </w:tabs>
+        <w:bidi w:val="0"/>
+        <w:ind w:hanging="283" w:start="709"/>
+        <w:jc w:val="start"/>
+        <w:rPr/>
+      </w:pPr>
+      <w:r>
+        <w:rPr>
+          <w:b/>
+        </w:rPr>
+        <w:t>Cascade Logic (</w:t>
+      </w:r>
+      <w:r>
+        <w:rPr>
+          <w:rStyle w:val="Tekstrdowyuser"/>
+          <w:b/>
+        </w:rPr>
+        <w:t>Order == 0</w:t>
+      </w:r>
+      <w:r>
+        <w:rPr>
+          <w:b/>
+        </w:rPr>
+        <w:t xml:space="preserve"> - Primary Creator):</w:t>
+      </w:r>
+    </w:p>
+    <w:p>
+      <w:pPr>
+        <w:pStyle w:val="BodyText"/>
+        <w:numPr>
+          <w:ilvl w:val="1"/>
+          <w:numId w:val="5"/>
+        </w:numPr>
+        <w:tabs>
+          <w:tab w:val="clear" w:pos="709"/>
+          <w:tab w:val="left" w:pos="1418" w:leader="none"/>
+        </w:tabs>
+        <w:bidi w:val="0"/>
+        <w:ind w:hanging="283" w:start="1418"/>
+        <w:jc w:val="start"/>
+        <w:rPr/>
+      </w:pPr>
+      <w:r>
+        <w:rPr/>
+        <w:t xml:space="preserve">Find all songs where this artist has </w:t>
+      </w:r>
+      <w:r>
+        <w:rPr>
+          <w:rStyle w:val="Tekstrdowyuser"/>
+        </w:rPr>
+        <w:t>artist_order == 0</w:t>
+      </w:r>
+      <w:r>
+        <w:rPr/>
+        <w:t xml:space="preserve">. Call </w:t>
+      </w:r>
+      <w:r>
+        <w:rPr>
+          <w:rStyle w:val="Tekstrdowyuser"/>
+        </w:rPr>
+        <w:t>song.deactivate()</w:t>
+      </w:r>
+      <w:r>
+        <w:rPr/>
+        <w:t xml:space="preserve"> on each of them. (This will also trigger the cascade to Prices, as described in point 3).</w:t>
+      </w:r>
+    </w:p>
+    <w:p>
+      <w:pPr>
+        <w:pStyle w:val="BodyText"/>
+        <w:numPr>
+          <w:ilvl w:val="1"/>
+          <w:numId w:val="5"/>
+        </w:numPr>
+        <w:tabs>
+          <w:tab w:val="clear" w:pos="709"/>
+          <w:tab w:val="left" w:pos="1418" w:leader="none"/>
+        </w:tabs>
+        <w:bidi w:val="0"/>
+        <w:ind w:hanging="283" w:start="1418"/>
+        <w:jc w:val="start"/>
+        <w:rPr/>
+      </w:pPr>
+      <w:r>
+        <w:rPr/>
+        <w:t xml:space="preserve">Find solo albums (where they are the only creator at position 0) and call </w:t>
+      </w:r>
+      <w:r>
+        <w:rPr>
+          <w:rStyle w:val="Tekstrdowyuser"/>
+        </w:rPr>
+        <w:t>album.deactivate()</w:t>
+      </w:r>
+      <w:r>
+        <w:rPr/>
+        <w:t xml:space="preserve"> on them.</w:t>
+      </w:r>
+    </w:p>
+    <w:p>
+      <w:pPr>
+        <w:pStyle w:val="BodyText"/>
+        <w:numPr>
+          <w:ilvl w:val="0"/>
+          <w:numId w:val="5"/>
+        </w:numPr>
+        <w:tabs>
+          <w:tab w:val="left" w:pos="709" w:leader="none"/>
+        </w:tabs>
+        <w:bidi w:val="0"/>
+        <w:ind w:hanging="283" w:start="709"/>
+        <w:jc w:val="start"/>
+        <w:rPr/>
+      </w:pPr>
+      <w:r>
+        <w:rPr>
+          <w:b/>
+        </w:rPr>
+        <w:t>Passive Logic (</w:t>
+      </w:r>
+      <w:r>
+        <w:rPr>
+          <w:rStyle w:val="Tekstrdowyuser"/>
+          <w:b/>
+        </w:rPr>
+        <w:t>Order &gt; 0</w:t>
+      </w:r>
+      <w:r>
+        <w:rPr>
+          <w:b/>
+        </w:rPr>
+        <w:t xml:space="preserve"> - Guest/Featured):</w:t>
+      </w:r>
+    </w:p>
+    <w:p>
+      <w:pPr>
+        <w:pStyle w:val="BodyText"/>
+        <w:numPr>
+          <w:ilvl w:val="1"/>
+          <w:numId w:val="5"/>
+        </w:numPr>
+        <w:tabs>
+          <w:tab w:val="clear" w:pos="709"/>
+          <w:tab w:val="left" w:pos="1418" w:leader="none"/>
+        </w:tabs>
+        <w:bidi w:val="0"/>
+        <w:ind w:hanging="283" w:start="1418"/>
+        <w:jc w:val="start"/>
+        <w:rPr/>
+      </w:pPr>
+      <w:r>
+        <w:rPr/>
+        <w:t>If the artist appears exclusively in secondary positions, you do not damage other creators' resources. The primary artist's song remains active (</w:t>
+      </w:r>
+      <w:r>
+        <w:rPr>
+          <w:rStyle w:val="Tekstrdowyuser"/>
+        </w:rPr>
+        <w:t>active = true</w:t>
+      </w:r>
+      <w:r>
+        <w:rPr/>
+        <w:t>).</w:t>
+      </w:r>
+    </w:p>
+    <w:p>
+      <w:pPr>
+        <w:pStyle w:val="BodyText"/>
+        <w:numPr>
+          <w:ilvl w:val="0"/>
+          <w:numId w:val="5"/>
+        </w:numPr>
+        <w:tabs>
+          <w:tab w:val="left" w:pos="709" w:leader="none"/>
+        </w:tabs>
+        <w:bidi w:val="0"/>
+        <w:ind w:hanging="283" w:start="709"/>
+        <w:jc w:val="start"/>
+        <w:rPr/>
+      </w:pPr>
+      <w:r>
+        <w:rPr>
+          <w:b/>
+        </w:rPr>
         <w:t>Frontend Handling (Guest View):</w:t>
       </w:r>
       <w:r>
@@ -952,7 +958,7 @@
       </w:r>
       <w:r>
         <w:rPr>
-          <w:rStyle w:val="Tekstrdowy"/>
+          <w:rStyle w:val="Tekstrdowyuser"/>
         </w:rPr>
         <w:t>active == false</w:t>
       </w:r>
@@ -990,138 +996,120 @@
   <w:abstractNum w:abstractNumId="1">
     <w:lvl w:ilvl="0">
       <w:start w:val="1"/>
-      <w:numFmt w:val="bullet"/>
-      <w:lvlText w:val=""/>
-      <w:lvlJc w:val="start"/>
-      <w:pPr>
-        <w:tabs>
-          <w:tab w:val="num" w:pos="709"/>
-        </w:tabs>
-        <w:ind w:start="709" w:hanging="283"/>
-      </w:pPr>
-      <w:rPr>
-        <w:rFonts w:ascii="Symbol" w:hAnsi="Symbol" w:cs="Symbol" w:hint="default"/>
-      </w:rPr>
+      <w:numFmt w:val="none"/>
+      <w:suff w:val="nothing"/>
+      <w:lvlText w:val=""/>
+      <w:lvlJc w:val="start"/>
+      <w:pPr>
+        <w:tabs>
+          <w:tab w:val="num" w:pos="0"/>
+        </w:tabs>
+        <w:ind w:start="0" w:hanging="0"/>
+      </w:pPr>
     </w:lvl>
     <w:lvl w:ilvl="1">
       <w:start w:val="1"/>
-      <w:numFmt w:val="bullet"/>
-      <w:lvlText w:val=""/>
-      <w:lvlJc w:val="start"/>
-      <w:pPr>
-        <w:tabs>
-          <w:tab w:val="num" w:pos="1418"/>
-        </w:tabs>
-        <w:ind w:start="1418" w:hanging="283"/>
-      </w:pPr>
-      <w:rPr>
-        <w:rFonts w:ascii="Symbol" w:hAnsi="Symbol" w:cs="Symbol" w:hint="default"/>
-      </w:rPr>
+      <w:numFmt w:val="none"/>
+      <w:suff w:val="nothing"/>
+      <w:lvlText w:val=""/>
+      <w:lvlJc w:val="start"/>
+      <w:pPr>
+        <w:tabs>
+          <w:tab w:val="num" w:pos="0"/>
+        </w:tabs>
+        <w:ind w:start="0" w:hanging="0"/>
+      </w:pPr>
     </w:lvl>
     <w:lvl w:ilvl="2">
       <w:start w:val="1"/>
-      <w:numFmt w:val="bullet"/>
-      <w:lvlText w:val=""/>
-      <w:lvlJc w:val="start"/>
-      <w:pPr>
-        <w:tabs>
-          <w:tab w:val="num" w:pos="2127"/>
-        </w:tabs>
-        <w:ind w:start="2127" w:hanging="283"/>
-      </w:pPr>
-      <w:rPr>
-        <w:rFonts w:ascii="Symbol" w:hAnsi="Symbol" w:cs="Symbol" w:hint="default"/>
-      </w:rPr>
+      <w:numFmt w:val="none"/>
+      <w:suff w:val="nothing"/>
+      <w:lvlText w:val=""/>
+      <w:lvlJc w:val="start"/>
+      <w:pPr>
+        <w:tabs>
+          <w:tab w:val="num" w:pos="0"/>
+        </w:tabs>
+        <w:ind w:start="0" w:hanging="0"/>
+      </w:pPr>
     </w:lvl>
     <w:lvl w:ilvl="3">
       <w:start w:val="1"/>
-      <w:numFmt w:val="bullet"/>
-      <w:lvlText w:val=""/>
-      <w:lvlJc w:val="start"/>
-      <w:pPr>
-        <w:tabs>
-          <w:tab w:val="num" w:pos="2836"/>
-        </w:tabs>
-        <w:ind w:start="2836" w:hanging="283"/>
-      </w:pPr>
-      <w:rPr>
-        <w:rFonts w:ascii="Symbol" w:hAnsi="Symbol" w:cs="Symbol" w:hint="default"/>
-      </w:rPr>
+      <w:numFmt w:val="none"/>
+      <w:suff w:val="nothing"/>
+      <w:lvlText w:val=""/>
+      <w:lvlJc w:val="start"/>
+      <w:pPr>
+        <w:tabs>
+          <w:tab w:val="num" w:pos="0"/>
+        </w:tabs>
+        <w:ind w:start="0" w:hanging="0"/>
+      </w:pPr>
     </w:lvl>
     <w:lvl w:ilvl="4">
       <w:start w:val="1"/>
-      <w:numFmt w:val="bullet"/>
-      <w:lvlText w:val=""/>
-      <w:lvlJc w:val="start"/>
-      <w:pPr>
-        <w:tabs>
-          <w:tab w:val="num" w:pos="3545"/>
-        </w:tabs>
-        <w:ind w:start="3545" w:hanging="283"/>
-      </w:pPr>
-      <w:rPr>
-        <w:rFonts w:ascii="Symbol" w:hAnsi="Symbol" w:cs="Symbol" w:hint="default"/>
-      </w:rPr>
+      <w:numFmt w:val="none"/>
+      <w:suff w:val="nothing"/>
+      <w:lvlText w:val=""/>
+      <w:lvlJc w:val="start"/>
+      <w:pPr>
+        <w:tabs>
+          <w:tab w:val="num" w:pos="0"/>
+        </w:tabs>
+        <w:ind w:start="0" w:hanging="0"/>
+      </w:pPr>
     </w:lvl>
     <w:lvl w:ilvl="5">
       <w:start w:val="1"/>
-      <w:numFmt w:val="bullet"/>
-      <w:lvlText w:val=""/>
-      <w:lvlJc w:val="start"/>
-      <w:pPr>
-        <w:tabs>
-          <w:tab w:val="num" w:pos="4254"/>
-        </w:tabs>
-        <w:ind w:start="4254" w:hanging="283"/>
-      </w:pPr>
-      <w:rPr>
-        <w:rFonts w:ascii="Symbol" w:hAnsi="Symbol" w:cs="Symbol" w:hint="default"/>
-      </w:rPr>
+      <w:numFmt w:val="none"/>
+      <w:suff w:val="nothing"/>
+      <w:lvlText w:val=""/>
+      <w:lvlJc w:val="start"/>
+      <w:pPr>
+        <w:tabs>
+          <w:tab w:val="num" w:pos="0"/>
+        </w:tabs>
+        <w:ind w:start="0" w:hanging="0"/>
+      </w:pPr>
     </w:lvl>
     <w:lvl w:ilvl="6">
       <w:start w:val="1"/>
-      <w:numFmt w:val="bullet"/>
-      <w:lvlText w:val=""/>
-      <w:lvlJc w:val="start"/>
-      <w:pPr>
-        <w:tabs>
-          <w:tab w:val="num" w:pos="4963"/>
-        </w:tabs>
-        <w:ind w:start="4963" w:hanging="283"/>
-      </w:pPr>
-      <w:rPr>
-        <w:rFonts w:ascii="Symbol" w:hAnsi="Symbol" w:cs="Symbol" w:hint="default"/>
-      </w:rPr>
+      <w:numFmt w:val="none"/>
+      <w:suff w:val="nothing"/>
+      <w:lvlText w:val=""/>
+      <w:lvlJc w:val="start"/>
+      <w:pPr>
+        <w:tabs>
+          <w:tab w:val="num" w:pos="0"/>
+        </w:tabs>
+        <w:ind w:start="0" w:hanging="0"/>
+      </w:pPr>
     </w:lvl>
     <w:lvl w:ilvl="7">
       <w:start w:val="1"/>
-      <w:numFmt w:val="bullet"/>
-      <w:lvlText w:val=""/>
-      <w:lvlJc w:val="start"/>
-      <w:pPr>
-        <w:tabs>
-          <w:tab w:val="num" w:pos="5672"/>
-        </w:tabs>
-        <w:ind w:start="5672" w:hanging="283"/>
-      </w:pPr>
-      <w:rPr>
-        <w:rFonts w:ascii="Symbol" w:hAnsi="Symbol" w:cs="Symbol" w:hint="default"/>
-      </w:rPr>
+      <w:numFmt w:val="none"/>
+      <w:suff w:val="nothing"/>
+      <w:lvlText w:val=""/>
+      <w:lvlJc w:val="start"/>
+      <w:pPr>
+        <w:tabs>
+          <w:tab w:val="num" w:pos="0"/>
+        </w:tabs>
+        <w:ind w:start="0" w:hanging="0"/>
+      </w:pPr>
     </w:lvl>
     <w:lvl w:ilvl="8">
       <w:start w:val="1"/>
-      <w:numFmt w:val="bullet"/>
-      <w:lvlText w:val=""/>
-      <w:lvlJc w:val="start"/>
-      <w:pPr>
-        <w:tabs>
-          <w:tab w:val="num" w:pos="6381"/>
-        </w:tabs>
-        <w:ind w:start="6381" w:hanging="283"/>
-      </w:pPr>
-      <w:rPr>
-        <w:rFonts w:ascii="Symbol" w:hAnsi="Symbol" w:cs="Symbol" w:hint="default"/>
-      </w:rPr>
+      <w:numFmt w:val="none"/>
+      <w:suff w:val="nothing"/>
+      <w:lvlText w:val=""/>
+      <w:lvlJc w:val="start"/>
+      <w:pPr>
+        <w:tabs>
+          <w:tab w:val="num" w:pos="0"/>
+        </w:tabs>
+        <w:ind w:start="0" w:hanging="0"/>
+      </w:pPr>
     </w:lvl>
   </w:abstractNum>
   <w:abstractNum w:abstractNumId="2">
@@ -1538,120 +1526,138 @@
   <w:abstractNum w:abstractNumId="5">
     <w:lvl w:ilvl="0">
       <w:start w:val="1"/>
-      <w:numFmt w:val="none"/>
-      <w:suff w:val="nothing"/>
-      <w:lvlText w:val=""/>
-      <w:lvlJc w:val="start"/>
-      <w:pPr>
-        <w:tabs>
-          <w:tab w:val="num" w:pos="0"/>
-        </w:tabs>
-        <w:ind w:start="0" w:hanging="0"/>
-      </w:pPr>
+      <w:numFmt w:val="bullet"/>
+      <w:lvlText w:val=""/>
+      <w:lvlJc w:val="start"/>
+      <w:pPr>
+        <w:tabs>
+          <w:tab w:val="num" w:pos="709"/>
+        </w:tabs>
+        <w:ind w:start="709" w:hanging="283"/>
+      </w:pPr>
+      <w:rPr>
+        <w:rFonts w:ascii="Symbol" w:hAnsi="Symbol" w:cs="Symbol" w:hint="default"/>
+      </w:rPr>
     </w:lvl>
     <w:lvl w:ilvl="1">
       <w:start w:val="1"/>
-      <w:numFmt w:val="none"/>
-      <w:suff w:val="nothing"/>
-      <w:lvlText w:val=""/>
-      <w:lvlJc w:val="start"/>
-      <w:pPr>
-        <w:tabs>
-          <w:tab w:val="num" w:pos="0"/>
-        </w:tabs>
-        <w:ind w:start="0" w:hanging="0"/>
-      </w:pPr>
+      <w:numFmt w:val="bullet"/>
+      <w:lvlText w:val=""/>
+      <w:lvlJc w:val="start"/>
+      <w:pPr>
+        <w:tabs>
+          <w:tab w:val="num" w:pos="1418"/>
+        </w:tabs>
+        <w:ind w:start="1418" w:hanging="283"/>
+      </w:pPr>
+      <w:rPr>
+        <w:rFonts w:ascii="Symbol" w:hAnsi="Symbol" w:cs="Symbol" w:hint="default"/>
+      </w:rPr>
     </w:lvl>
     <w:lvl w:ilvl="2">
       <w:start w:val="1"/>
-      <w:numFmt w:val="none"/>
-      <w:suff w:val="nothing"/>
-      <w:lvlText w:val=""/>
-      <w:lvlJc w:val="start"/>
-      <w:pPr>
-        <w:tabs>
-          <w:tab w:val="num" w:pos="0"/>
-        </w:tabs>
-        <w:ind w:start="0" w:hanging="0"/>
-      </w:pPr>
+      <w:numFmt w:val="bullet"/>
+      <w:lvlText w:val=""/>
+      <w:lvlJc w:val="start"/>
+      <w:pPr>
+        <w:tabs>
+          <w:tab w:val="num" w:pos="2127"/>
+        </w:tabs>
+        <w:ind w:start="2127" w:hanging="283"/>
+      </w:pPr>
+      <w:rPr>
+        <w:rFonts w:ascii="Symbol" w:hAnsi="Symbol" w:cs="Symbol" w:hint="default"/>
+      </w:rPr>
     </w:lvl>
     <w:lvl w:ilvl="3">
       <w:start w:val="1"/>
-      <w:numFmt w:val="none"/>
-      <w:suff w:val="nothing"/>
-      <w:lvlText w:val=""/>
-      <w:lvlJc w:val="start"/>
-      <w:pPr>
-        <w:tabs>
-          <w:tab w:val="num" w:pos="0"/>
-        </w:tabs>
-        <w:ind w:start="0" w:hanging="0"/>
-      </w:pPr>
+      <w:numFmt w:val="bullet"/>
+      <w:lvlText w:val=""/>
+      <w:lvlJc w:val="start"/>
+      <w:pPr>
+        <w:tabs>
+          <w:tab w:val="num" w:pos="2836"/>
+        </w:tabs>
+        <w:ind w:start="2836" w:hanging="283"/>
+      </w:pPr>
+      <w:rPr>
+        <w:rFonts w:ascii="Symbol" w:hAnsi="Symbol" w:cs="Symbol" w:hint="default"/>
+      </w:rPr>
     </w:lvl>
     <w:lvl w:ilvl="4">
       <w:start w:val="1"/>
-      <w:numFmt w:val="none"/>
-      <w:suff w:val="nothing"/>
-      <w:lvlText w:val=""/>
-      <w:lvlJc w:val="start"/>
-      <w:pPr>
-        <w:tabs>
-          <w:tab w:val="num" w:pos="0"/>
-        </w:tabs>
-        <w:ind w:start="0" w:hanging="0"/>
-      </w:pPr>
+      <w:numFmt w:val="bullet"/>
+      <w:lvlText w:val=""/>
+      <w:lvlJc w:val="start"/>
+      <w:pPr>
+        <w:tabs>
+          <w:tab w:val="num" w:pos="3545"/>
+        </w:tabs>
+        <w:ind w:start="3545" w:hanging="283"/>
+      </w:pPr>
+      <w:rPr>
+        <w:rFonts w:ascii="Symbol" w:hAnsi="Symbol" w:cs="Symbol" w:hint="default"/>
+      </w:rPr>
     </w:lvl>
     <w:lvl w:ilvl="5">
       <w:start w:val="1"/>
-      <w:numFmt w:val="none"/>
-      <w:suff w:val="nothing"/>
-      <w:lvlText w:val=""/>
-      <w:lvlJc w:val="start"/>
-      <w:pPr>
-        <w:tabs>
-          <w:tab w:val="num" w:pos="0"/>
-        </w:tabs>
-        <w:ind w:start="0" w:hanging="0"/>
-      </w:pPr>
+      <w:numFmt w:val="bullet"/>
+      <w:lvlText w:val=""/>
+      <w:lvlJc w:val="start"/>
+      <w:pPr>
+        <w:tabs>
+          <w:tab w:val="num" w:pos="4254"/>
+        </w:tabs>
+        <w:ind w:start="4254" w:hanging="283"/>
+      </w:pPr>
+      <w:rPr>
+        <w:rFonts w:ascii="Symbol" w:hAnsi="Symbol" w:cs="Symbol" w:hint="default"/>
+      </w:rPr>
     </w:lvl>
     <w:lvl w:ilvl="6">
       <w:start w:val="1"/>
-      <w:numFmt w:val="none"/>
-      <w:suff w:val="nothing"/>
-      <w:lvlText w:val=""/>
-      <w:lvlJc w:val="start"/>
-      <w:pPr>
-        <w:tabs>
-          <w:tab w:val="num" w:pos="0"/>
-        </w:tabs>
-        <w:ind w:start="0" w:hanging="0"/>
-      </w:pPr>
+      <w:numFmt w:val="bullet"/>
+      <w:lvlText w:val=""/>
+      <w:lvlJc w:val="start"/>
+      <w:pPr>
+        <w:tabs>
+          <w:tab w:val="num" w:pos="4963"/>
+        </w:tabs>
+        <w:ind w:start="4963" w:hanging="283"/>
+      </w:pPr>
+      <w:rPr>
+        <w:rFonts w:ascii="Symbol" w:hAnsi="Symbol" w:cs="Symbol" w:hint="default"/>
+      </w:rPr>
     </w:lvl>
     <w:lvl w:ilvl="7">
       <w:start w:val="1"/>
-      <w:numFmt w:val="none"/>
-      <w:suff w:val="nothing"/>
-      <w:lvlText w:val=""/>
-      <w:lvlJc w:val="start"/>
-      <w:pPr>
-        <w:tabs>
-          <w:tab w:val="num" w:pos="0"/>
-        </w:tabs>
-        <w:ind w:start="0" w:hanging="0"/>
-      </w:pPr>
+      <w:numFmt w:val="bullet"/>
+      <w:lvlText w:val=""/>
+      <w:lvlJc w:val="start"/>
+      <w:pPr>
+        <w:tabs>
+          <w:tab w:val="num" w:pos="5672"/>
+        </w:tabs>
+        <w:ind w:start="5672" w:hanging="283"/>
+      </w:pPr>
+      <w:rPr>
+        <w:rFonts w:ascii="Symbol" w:hAnsi="Symbol" w:cs="Symbol" w:hint="default"/>
+      </w:rPr>
     </w:lvl>
     <w:lvl w:ilvl="8">
       <w:start w:val="1"/>
-      <w:numFmt w:val="none"/>
-      <w:suff w:val="nothing"/>
-      <w:lvlText w:val=""/>
-      <w:lvlJc w:val="start"/>
-      <w:pPr>
-        <w:tabs>
-          <w:tab w:val="num" w:pos="0"/>
-        </w:tabs>
-        <w:ind w:start="0" w:hanging="0"/>
-      </w:pPr>
+      <w:numFmt w:val="bullet"/>
+      <w:lvlText w:val=""/>
+      <w:lvlJc w:val="start"/>
+      <w:pPr>
+        <w:tabs>
+          <w:tab w:val="num" w:pos="6381"/>
+        </w:tabs>
+        <w:ind w:start="6381" w:hanging="283"/>
+      </w:pPr>
+      <w:rPr>
+        <w:rFonts w:ascii="Symbol" w:hAnsi="Symbol" w:cs="Symbol" w:hint="default"/>
+      </w:rPr>
     </w:lvl>
   </w:abstractNum>
   <w:num w:numId="1">
@@ -1711,7 +1717,7 @@
   </w:style>
   <w:style w:type="paragraph" w:styleId="Heading3">
     <w:name w:val="heading 3"/>
-    <w:basedOn w:val="Nagwek"/>
+    <w:basedOn w:val="Nagwekuser"/>
     <w:next w:val="BodyText"/>
     <w:qFormat/>
     <w:pPr>
@@ -1734,15 +1740,15 @@
       <w:bCs/>
     </w:rPr>
   </w:style>
-  <w:style w:type="character" w:styleId="Tekstrdowy">
-    <w:name w:val="Tekst źródłowy"/>
+  <w:style w:type="character" w:styleId="Tekstrdowyuser">
+    <w:name w:val="Tekst źródłowy (user)"/>
     <w:qFormat/>
     <w:rPr>
       <w:rFonts w:ascii="Liberation Mono" w:hAnsi="Liberation Mono" w:eastAsia="NSimSun" w:cs="Liberation Mono"/>
     </w:rPr>
   </w:style>
-  <w:style w:type="character" w:styleId="Znakiwypunktowania">
-    <w:name w:val="Znaki wypunktowania"/>
+  <w:style w:type="character" w:styleId="Znakiwypunktowaniauser">
+    <w:name w:val="Znaki wypunktowania (user)"/>
     <w:qFormat/>
     <w:rPr>
       <w:rFonts w:ascii="OpenSymbol" w:hAnsi="OpenSymbol" w:eastAsia="OpenSymbol" w:cs="OpenSymbol"/>
@@ -1832,8 +1838,8 @@
       <w:rFonts w:cs="Arial"/>
     </w:rPr>
   </w:style>
-  <w:style w:type="paragraph" w:styleId="Zawartotabeli">
-    <w:name w:val="Zawartość tabeli"/>
+  <w:style w:type="paragraph" w:styleId="Zawartotabeliuser">
+    <w:name w:val="Zawartość tabeli (user)"/>
     <w:basedOn w:val="Normal"/>
     <w:qFormat/>
     <w:pPr>
@@ -1842,9 +1848,9 @@
     </w:pPr>
     <w:rPr/>
   </w:style>
-  <w:style w:type="paragraph" w:styleId="Nagwektabeli">
-    <w:name w:val="Nagłówek tabeli"/>
-    <w:basedOn w:val="Zawartotabeli"/>
+  <w:style w:type="paragraph" w:styleId="Nagwektabeliuser">
+    <w:name w:val="Nagłówek tabeli (user)"/>
+    <w:basedOn w:val="Zawartotabeliuser"/>
     <w:qFormat/>
     <w:pPr>
       <w:suppressLineNumbers/>

</xml_diff>